<commit_message>
Added image descriptions; Updated resume
</commit_message>
<xml_diff>
--- a/resume.docx
+++ b/resume.docx
@@ -1,25 +1,30 @@
 
 <file path=word/document.xml><?xml version="1.0" encoding="utf-8"?>
-<w:document xmlns:wpc="http://schemas.microsoft.com/office/word/2010/wordprocessingCanvas" xmlns:cx="http://schemas.microsoft.com/office/drawing/2014/chartex" xmlns:cx1="http://schemas.microsoft.com/office/drawing/2015/9/8/chartex" xmlns:cx2="http://schemas.microsoft.com/office/drawing/2015/10/21/chartex" xmlns:cx3="http://schemas.microsoft.com/office/drawing/2016/5/9/chartex" xmlns:cx4="http://schemas.microsoft.com/office/drawing/2016/5/10/chartex" xmlns:cx5="http://schemas.microsoft.com/office/drawing/2016/5/11/chartex" xmlns:cx6="http://schemas.microsoft.com/office/drawing/2016/5/12/chartex" xmlns:cx7="http://schemas.microsoft.com/office/drawing/2016/5/13/chartex" xmlns:cx8="http://schemas.microsoft.com/office/drawing/2016/5/14/chartex" xmlns:mc="http://schemas.openxmlformats.org/markup-compatibility/2006" xmlns:aink="http://schemas.microsoft.com/office/drawing/2016/ink" xmlns:am3d="http://schemas.microsoft.com/office/drawing/2017/model3d" xmlns:o="urn:schemas-microsoft-com:office:office" xmlns:oel="http://schemas.microsoft.com/office/2019/extlst" xmlns:r="http://schemas.openxmlformats.org/officeDocument/2006/relationships" xmlns:m="http://schemas.openxmlformats.org/officeDocument/2006/math" xmlns:v="urn:schemas-microsoft-com:vml" xmlns:wp14="http://schemas.microsoft.com/office/word/2010/wordprocessingDrawing" xmlns:wp="http://schemas.openxmlformats.org/drawingml/2006/wordprocessingDrawing" xmlns:w10="urn:schemas-microsoft-com:office:word" xmlns:w="http://schemas.openxmlformats.org/wordprocessingml/2006/main" xmlns:w14="http://schemas.microsoft.com/office/word/2010/wordml" xmlns:w15="http://schemas.microsoft.com/office/word/2012/wordml" xmlns:w16cei="http://schemas.microsoft.com/office/word/2026/wordml/cei" xmlns:w16cex="http://schemas.microsoft.com/office/word/2018/wordml/cex" xmlns:w16cid="http://schemas.microsoft.com/office/word/2016/wordml/cid" xmlns:w16="http://schemas.microsoft.com/office/word/2018/wordml" xmlns:w16du="http://schemas.microsoft.com/office/word/2023/wordml/word16du" xmlns:w16sdtdh="http://schemas.microsoft.com/office/word/2020/wordml/sdtdatahash" xmlns:w16sdtfl="http://schemas.microsoft.com/office/word/2024/wordml/sdtformatlock" xmlns:w16se="http://schemas.microsoft.com/office/word/2015/wordml/symex" xmlns:wpg="http://schemas.microsoft.com/office/word/2010/wordprocessingGroup" xmlns:wpi="http://schemas.microsoft.com/office/word/2010/wordprocessingInk" xmlns:wne="http://schemas.microsoft.com/office/word/2006/wordml" xmlns:wps="http://schemas.microsoft.com/office/word/2010/wordprocessingShape" mc:Ignorable="w14 w15 w16se w16cid w16 w16cex w16sdtdh w16sdtfl w16du wp14">
+<w:document xmlns:o="urn:schemas-microsoft-com:office:office" xmlns:r="http://schemas.openxmlformats.org/officeDocument/2006/relationships" xmlns:v="urn:schemas-microsoft-com:vml" xmlns:w="http://schemas.openxmlformats.org/wordprocessingml/2006/main" xmlns:w10="urn:schemas-microsoft-com:office:word" xmlns:wp="http://schemas.openxmlformats.org/drawingml/2006/wordprocessingDrawing" xmlns:wps="http://schemas.microsoft.com/office/word/2010/wordprocessingShape" xmlns:wpg="http://schemas.microsoft.com/office/word/2010/wordprocessingGroup" xmlns:mc="http://schemas.openxmlformats.org/markup-compatibility/2006" xmlns:wp14="http://schemas.microsoft.com/office/word/2010/wordprocessingDrawing" xmlns:w14="http://schemas.microsoft.com/office/word/2010/wordml" xmlns:w15="http://schemas.microsoft.com/office/word/2012/wordml" mc:Ignorable="w14 wp14 w15">
   <w:body>
     <w:p>
       <w:pPr>
         <w:pStyle w:val="Title"/>
-      </w:pPr>
-      <w:r>
+        <w:rPr/>
+      </w:pPr>
+      <w:r>
+        <w:rPr/>
         <w:t>Charles Oliner</w:t>
       </w:r>
     </w:p>
     <w:p>
       <w:pPr>
+        <w:pStyle w:val="Normal"/>
         <w:jc w:val="center"/>
-      </w:pPr>
-      <w:r>
+        <w:rPr/>
+      </w:pPr>
+      <w:r>
+        <w:rPr/>
         <w:t xml:space="preserve">Garrett Park, Maryland </w:t>
       </w:r>
       <w:r>
         <w:rPr>
-          <w:rFonts w:ascii="Segoe UI Symbol" w:hAnsi="Segoe UI Symbol" w:cs="Segoe UI Symbol"/>
+          <w:rFonts w:cs="Segoe UI Symbol" w:ascii="Segoe UI Symbol" w:hAnsi="Segoe UI Symbol"/>
           <w:sz w:val="26"/>
           <w:szCs w:val="26"/>
         </w:rPr>
@@ -27,21 +32,19 @@
       </w:r>
       <w:r>
         <w:rPr>
-          <w:rFonts w:asciiTheme="minorHAnsi" w:hAnsiTheme="minorHAnsi" w:cstheme="minorHAnsi"/>
+          <w:rFonts w:cs="Calibri" w:ascii="Calibri" w:hAnsi="Calibri" w:asciiTheme="minorHAnsi" w:cstheme="minorHAnsi" w:hAnsiTheme="minorHAnsi"/>
           <w:sz w:val="26"/>
           <w:szCs w:val="26"/>
         </w:rPr>
         <w:t xml:space="preserve"> </w:t>
       </w:r>
       <w:r>
-        <w:t>olinercharles@gmail</w:t>
-      </w:r>
-      <w:r>
-        <w:t xml:space="preserve">.com </w:t>
+        <w:rPr/>
+        <w:t xml:space="preserve">olinercharles@gmail.com </w:t>
       </w:r>
       <w:r>
         <w:rPr>
-          <w:rFonts w:ascii="Segoe UI Symbol" w:hAnsi="Segoe UI Symbol" w:cs="Segoe UI Symbol"/>
+          <w:rFonts w:cs="Segoe UI Symbol" w:ascii="Segoe UI Symbol" w:hAnsi="Segoe UI Symbol"/>
           <w:sz w:val="26"/>
           <w:szCs w:val="26"/>
         </w:rPr>
@@ -49,61 +52,66 @@
       </w:r>
       <w:r>
         <w:rPr>
-          <w:rFonts w:asciiTheme="minorHAnsi" w:hAnsiTheme="minorHAnsi" w:cstheme="minorHAnsi"/>
+          <w:rFonts w:cs="Calibri" w:ascii="Calibri" w:hAnsi="Calibri" w:asciiTheme="minorHAnsi" w:cstheme="minorHAnsi" w:hAnsiTheme="minorHAnsi"/>
           <w:sz w:val="26"/>
           <w:szCs w:val="26"/>
         </w:rPr>
         <w:t xml:space="preserve"> </w:t>
       </w:r>
       <w:r>
+        <w:rPr/>
         <w:t>(805) 490-2951</w:t>
       </w:r>
     </w:p>
     <w:p>
       <w:pPr>
         <w:pStyle w:val="Heading1"/>
-      </w:pPr>
-      <w:r>
+        <w:rPr/>
+      </w:pPr>
+      <w:r>
+        <w:rPr/>
         <w:t>Professional Summary</w:t>
       </w:r>
     </w:p>
     <w:p>
       <w:pPr>
-        <w:spacing w:line="278" w:lineRule="auto"/>
-      </w:pPr>
-      <w:r>
-        <w:t>Versatile Software Developer with 8+ years of experience designing and developing full-stack applications, interactive experiences, software tools, and 3D applications across freelance, commercial, and government environments. Experienced in C#, .NET, TypeScript, JavaScript, React.js, Node.js, Unity3D, and cloud platforms including AWS and Azure. Proven ability to contribute to Agile development teams supporting federal agencies, including the U.S. Department of Justice and Department of Homeland Security, while collaborating with cross-functional teams to deliver scalable software solutions. Skilled in UI/UX design, distributed systems, databases, APIs, CI/CD, and cloud technologies, with additional experience in WordPress, web development, 3D graphics, shaders, and technical client support. Recognized for strong communication, adaptability, and the ability to independently deliver complex technical projects from concept through implementation.</w:t>
+        <w:pStyle w:val="Normal"/>
+        <w:spacing w:lineRule="auto" w:line="276"/>
+        <w:rPr/>
+      </w:pPr>
+      <w:r>
+        <w:rPr/>
+        <w:t>Full-stack software developer with government experience, including U.S. Department of Justice and Homeland Security. Skilled in UI/UX design, distributed systems, databases, APIs, CI/CD, and cloud technologies. Looking for a role where I am challenged to push the limits of a software stack to create real world value for end users.</w:t>
       </w:r>
     </w:p>
     <w:p>
       <w:pPr>
         <w:pStyle w:val="Heading1"/>
-      </w:pPr>
-      <w:r>
+        <w:rPr/>
+      </w:pPr>
+      <w:r>
+        <w:rPr/>
         <w:t>Experience</w:t>
       </w:r>
     </w:p>
     <w:p>
       <w:pPr>
         <w:pStyle w:val="Heading2"/>
-      </w:pPr>
-      <w:r>
-        <w:t>Freelance Software Developer</w:t>
+        <w:rPr/>
+      </w:pPr>
+      <w:r>
+        <w:rPr/>
+        <w:t>Software Developer</w:t>
       </w:r>
     </w:p>
     <w:p>
       <w:pPr>
         <w:pStyle w:val="Heading3"/>
-      </w:pPr>
-      <w:proofErr w:type="spellStart"/>
-      <w:r>
-        <w:t>Biovisualization</w:t>
-      </w:r>
-      <w:proofErr w:type="spellEnd"/>
-      <w:r>
-        <w:t>, LLC</w:t>
-      </w:r>
-      <w:r>
+        <w:rPr/>
+      </w:pPr>
+      <w:r>
+        <w:rPr/>
+        <w:t>Biovisualization, LLC</w:t>
         <w:tab/>
         <w:t>January 2025 – Current</w:t>
       </w:r>
@@ -115,17 +123,11 @@
           <w:ilvl w:val="0"/>
           <w:numId w:val="1"/>
         </w:numPr>
-      </w:pPr>
-      <w:r>
-        <w:t xml:space="preserve">Design and develop websites for clients using </w:t>
-      </w:r>
-      <w:proofErr w:type="spellStart"/>
-      <w:r>
-        <w:t>Wordpress</w:t>
-      </w:r>
-      <w:proofErr w:type="spellEnd"/>
-      <w:r>
-        <w:t>, Divi, JavaScript, CSS, and HTML.</w:t>
+        <w:rPr/>
+      </w:pPr>
+      <w:r>
+        <w:rPr/>
+        <w:t>Design and develop websites for clients using JavaScript, CSS, and HTML.</w:t>
       </w:r>
     </w:p>
     <w:p>
@@ -135,8 +137,10 @@
           <w:ilvl w:val="0"/>
           <w:numId w:val="1"/>
         </w:numPr>
-      </w:pPr>
-      <w:r>
+        <w:rPr/>
+      </w:pPr>
+      <w:r>
+        <w:rPr/>
         <w:t>Communicate with clients about website requirements.</w:t>
       </w:r>
     </w:p>
@@ -147,27 +151,31 @@
           <w:ilvl w:val="0"/>
           <w:numId w:val="1"/>
         </w:numPr>
-      </w:pPr>
-      <w:r>
+        <w:rPr/>
+      </w:pPr>
+      <w:r>
+        <w:rPr/>
         <w:t>Use Adobe Photoshop to turn drawings into heightmaps to prepare them to be 3D printed.</w:t>
       </w:r>
     </w:p>
     <w:p>
       <w:pPr>
         <w:pStyle w:val="Heading2"/>
-      </w:pPr>
-      <w:r>
-        <w:t>IT Technician</w:t>
+        <w:rPr/>
+      </w:pPr>
+      <w:r>
+        <w:rPr/>
+        <w:t>Software Developer and IT Technician</w:t>
       </w:r>
     </w:p>
     <w:p>
       <w:pPr>
         <w:pStyle w:val="Heading3"/>
-      </w:pPr>
-      <w:r>
+        <w:rPr/>
+      </w:pPr>
+      <w:r>
+        <w:rPr/>
         <w:t xml:space="preserve">Johnson’s Florist &amp; Garden Centers </w:t>
-      </w:r>
-      <w:r>
         <w:tab/>
         <w:t>March 2025 – Current</w:t>
       </w:r>
@@ -179,30 +187,11 @@
           <w:ilvl w:val="0"/>
           <w:numId w:val="1"/>
         </w:numPr>
-      </w:pPr>
-      <w:r>
-        <w:t xml:space="preserve">Develop and maintain custom software </w:t>
-      </w:r>
-      <w:r>
-        <w:t xml:space="preserve">in </w:t>
-      </w:r>
-      <w:r>
-        <w:t xml:space="preserve">C# and Python </w:t>
-      </w:r>
-      <w:r>
-        <w:t xml:space="preserve">that </w:t>
-      </w:r>
-      <w:r>
-        <w:t xml:space="preserve">interfaces </w:t>
-      </w:r>
-      <w:r>
-        <w:t>with Counterpoint</w:t>
-      </w:r>
-      <w:r>
-        <w:t xml:space="preserve"> to track inventory</w:t>
-      </w:r>
-      <w:r>
-        <w:t>.</w:t>
+        <w:rPr/>
+      </w:pPr>
+      <w:r>
+        <w:rPr/>
+        <w:t>Develop and maintain custom software in C# and Python that interfaces with Counterpoint to track inventory.</w:t>
       </w:r>
     </w:p>
     <w:p>
@@ -212,52 +201,31 @@
           <w:ilvl w:val="0"/>
           <w:numId w:val="1"/>
         </w:numPr>
-      </w:pPr>
-      <w:r>
-        <w:t>Perform data entry responsibilities using LibreOffice Calc.</w:t>
-      </w:r>
-    </w:p>
-    <w:p>
-      <w:pPr>
-        <w:pStyle w:val="ListParagraph"/>
-        <w:numPr>
-          <w:ilvl w:val="0"/>
-          <w:numId w:val="1"/>
-        </w:numPr>
-      </w:pPr>
-      <w:r>
-        <w:t xml:space="preserve">Customize Wix-based website using HTML and </w:t>
-      </w:r>
-      <w:proofErr w:type="spellStart"/>
-      <w:r>
-        <w:t>Javascript</w:t>
-      </w:r>
-      <w:proofErr w:type="spellEnd"/>
-      <w:r>
-        <w:t>.</w:t>
+        <w:rPr/>
+      </w:pPr>
+      <w:r>
+        <w:rPr/>
+        <w:t>Customize the store website using HTML and Javascript.</w:t>
       </w:r>
     </w:p>
     <w:p>
       <w:pPr>
         <w:pStyle w:val="Heading2"/>
-      </w:pPr>
-      <w:r>
+        <w:rPr/>
+      </w:pPr>
+      <w:r>
+        <w:rPr/>
         <w:t>Software Developer</w:t>
       </w:r>
     </w:p>
     <w:p>
       <w:pPr>
         <w:pStyle w:val="Heading3"/>
-      </w:pPr>
-      <w:proofErr w:type="spellStart"/>
-      <w:r>
-        <w:t>Smoothstack</w:t>
-      </w:r>
-      <w:proofErr w:type="spellEnd"/>
-      <w:r>
-        <w:t xml:space="preserve"> </w:t>
-      </w:r>
-      <w:r>
+        <w:rPr/>
+      </w:pPr>
+      <w:r>
+        <w:rPr/>
+        <w:t xml:space="preserve">Smoothstack </w:t>
         <w:tab/>
         <w:t>December 2019 - January 2023</w:t>
       </w:r>
@@ -269,8 +237,10 @@
           <w:ilvl w:val="0"/>
           <w:numId w:val="1"/>
         </w:numPr>
-      </w:pPr>
-      <w:r>
+        <w:rPr/>
+      </w:pPr>
+      <w:r>
+        <w:rPr/>
         <w:t>Created a timesheet application in Microsoft Dynamics as part of an Accenture Federal Services Agile development team subcontracted to the Dept of Justice using PowerApps, TypeScript, Node.js, React.js, C#, Azure DevOps, .NET 6.0, and Git.</w:t>
       </w:r>
     </w:p>
@@ -281,8 +251,10 @@
           <w:ilvl w:val="0"/>
           <w:numId w:val="1"/>
         </w:numPr>
-      </w:pPr>
-      <w:r>
+        <w:rPr/>
+      </w:pPr>
+      <w:r>
+        <w:rPr/>
         <w:t>Implemented a shared vision for a 3D webpage for the Dept of Justice utilizing AWS, TypeScript, Node.js, React.js, Three.js, and Git to create an interactive experience that organized information about bankruptcy.</w:t>
       </w:r>
     </w:p>
@@ -293,9 +265,15 @@
           <w:ilvl w:val="0"/>
           <w:numId w:val="1"/>
         </w:numPr>
-      </w:pPr>
-      <w:r>
-        <w:t>Co-developed the front end and back end of Protective DNS as part of an Accenture Federal Services Agile development team subcontracted to the Dept of Homeland Security. Used TypeScript, Node.js, React.js, and Git.</w:t>
+        <w:rPr/>
+      </w:pPr>
+      <w:r>
+        <w:rPr/>
+        <w:t>D</w:t>
+      </w:r>
+      <w:r>
+        <w:rPr/>
+        <w:t>eveloped the front-end and back-end of Protective DNS as part of an Accenture Federal Services Agile development team subcontracted to the Dept of Homeland Security. Used TypeScript, Node.js, React.js, and Git.</w:t>
       </w:r>
     </w:p>
     <w:p>
@@ -305,32 +283,31 @@
           <w:ilvl w:val="0"/>
           <w:numId w:val="1"/>
         </w:numPr>
-      </w:pPr>
-      <w:r>
+        <w:rPr/>
+      </w:pPr>
+      <w:r>
+        <w:rPr/>
         <w:t>Collaborated with team members to write user stories.</w:t>
       </w:r>
     </w:p>
     <w:p>
       <w:pPr>
         <w:pStyle w:val="Heading2"/>
-      </w:pPr>
-      <w:r>
-        <w:t>Freelance Software Developer</w:t>
+        <w:rPr/>
+      </w:pPr>
+      <w:r>
+        <w:rPr/>
+        <w:t>Software Developer</w:t>
       </w:r>
     </w:p>
     <w:p>
       <w:pPr>
         <w:pStyle w:val="Heading3"/>
-      </w:pPr>
-      <w:proofErr w:type="spellStart"/>
-      <w:r>
-        <w:t>Toptal</w:t>
-      </w:r>
-      <w:proofErr w:type="spellEnd"/>
-      <w:r>
-        <w:t xml:space="preserve"> </w:t>
-      </w:r>
-      <w:r>
+        <w:rPr/>
+      </w:pPr>
+      <w:r>
+        <w:rPr/>
+        <w:t xml:space="preserve">Toptal </w:t>
         <w:tab/>
         <w:t>October 2017 - December 2019</w:t>
       </w:r>
@@ -342,8 +319,10 @@
           <w:ilvl w:val="0"/>
           <w:numId w:val="2"/>
         </w:numPr>
-      </w:pPr>
-      <w:r>
+        <w:rPr/>
+      </w:pPr>
+      <w:r>
+        <w:rPr/>
         <w:t>Developed an Android/iOS game for a political campaign using C#, Unity3D, .NET Core, and Git.</w:t>
       </w:r>
     </w:p>
@@ -354,8 +333,10 @@
           <w:ilvl w:val="0"/>
           <w:numId w:val="2"/>
         </w:numPr>
-      </w:pPr>
-      <w:r>
+        <w:rPr/>
+      </w:pPr>
+      <w:r>
+        <w:rPr/>
         <w:t>Created a video streaming plugin for Unity3D using C#, .NET Core, and Git.</w:t>
       </w:r>
     </w:p>
@@ -366,28 +347,31 @@
           <w:ilvl w:val="0"/>
           <w:numId w:val="2"/>
         </w:numPr>
-      </w:pPr>
-      <w:r>
+        <w:rPr/>
+      </w:pPr>
+      <w:r>
+        <w:rPr/>
         <w:t>Implemented a 3D printing interface in Unity3D using C#, .NET Core, and Git.</w:t>
       </w:r>
     </w:p>
     <w:p>
       <w:pPr>
         <w:pStyle w:val="Heading2"/>
-      </w:pPr>
-      <w:r>
-        <w:lastRenderedPageBreak/>
-        <w:t>Freelance Software Developer</w:t>
+        <w:rPr/>
+      </w:pPr>
+      <w:r>
+        <w:rPr/>
+        <w:t>Software Developer</w:t>
       </w:r>
     </w:p>
     <w:p>
       <w:pPr>
         <w:pStyle w:val="Heading3"/>
-      </w:pPr>
-      <w:r>
+        <w:rPr/>
+      </w:pPr>
+      <w:r>
+        <w:rPr/>
         <w:t xml:space="preserve">Fiverr </w:t>
-      </w:r>
-      <w:r>
         <w:tab/>
         <w:t>September 2017 - January 2019</w:t>
       </w:r>
@@ -399,17 +383,11 @@
           <w:ilvl w:val="0"/>
           <w:numId w:val="3"/>
         </w:numPr>
-      </w:pPr>
-      <w:r>
-        <w:t xml:space="preserve">Completed 11 projects, including a procedurally animated dandelion logo, a lightweight HTTP server for music streaming, and several GPU shaders for screen-space distortions and effects. These projects involved Unity3D, C#, </w:t>
-      </w:r>
-      <w:proofErr w:type="spellStart"/>
-      <w:r>
-        <w:t>ShaderLab</w:t>
-      </w:r>
-      <w:proofErr w:type="spellEnd"/>
-      <w:r>
-        <w:t>, .NET Core, and Git.</w:t>
+        <w:rPr/>
+      </w:pPr>
+      <w:r>
+        <w:rPr/>
+        <w:t>Completed 11 projects, including a procedurally animated dandelion logo, a lightweight HTTP server for music streaming, and several GPU shaders for screen-space distortions and effects. These projects involved Unity3D, C#, ShaderLab, .NET Core, and Git.</w:t>
       </w:r>
     </w:p>
     <w:p>
@@ -419,35 +397,31 @@
           <w:ilvl w:val="0"/>
           <w:numId w:val="3"/>
         </w:numPr>
-      </w:pPr>
-      <w:r>
-        <w:t xml:space="preserve">Earned Level One Seller status with a </w:t>
-      </w:r>
-      <w:proofErr w:type="gramStart"/>
-      <w:r>
-        <w:t>4.8/5 star</w:t>
-      </w:r>
-      <w:proofErr w:type="gramEnd"/>
-      <w:r>
-        <w:t xml:space="preserve"> rating.</w:t>
+        <w:rPr/>
+      </w:pPr>
+      <w:r>
+        <w:rPr/>
+        <w:t>Earned Level One Seller status with a 4.8/5 star rating.</w:t>
       </w:r>
     </w:p>
     <w:p>
       <w:pPr>
         <w:pStyle w:val="Heading2"/>
-      </w:pPr>
-      <w:r>
-        <w:t>Freelance Asset Developer</w:t>
+        <w:rPr/>
+      </w:pPr>
+      <w:r>
+        <w:rPr/>
+        <w:t>Asset Developer</w:t>
       </w:r>
     </w:p>
     <w:p>
       <w:pPr>
         <w:pStyle w:val="Heading3"/>
-      </w:pPr>
-      <w:r>
+        <w:rPr/>
+      </w:pPr>
+      <w:r>
+        <w:rPr/>
         <w:t xml:space="preserve">Unity Asset Store </w:t>
-      </w:r>
-      <w:r>
         <w:tab/>
         <w:t>September 2017 - November 2018</w:t>
       </w:r>
@@ -459,8 +433,10 @@
           <w:ilvl w:val="0"/>
           <w:numId w:val="4"/>
         </w:numPr>
-      </w:pPr>
-      <w:r>
+        <w:rPr/>
+      </w:pPr>
+      <w:r>
+        <w:rPr/>
         <w:t>Created a command terminal for Unity3D games using C#, .NET Core, and Git.</w:t>
       </w:r>
     </w:p>
@@ -471,17 +447,11 @@
           <w:ilvl w:val="0"/>
           <w:numId w:val="4"/>
         </w:numPr>
-      </w:pPr>
-      <w:r>
-        <w:t xml:space="preserve">Used knowledge of 3D math to develop an outline shader system in Unity3D using C#, </w:t>
-      </w:r>
-      <w:proofErr w:type="spellStart"/>
-      <w:r>
-        <w:t>ShaderLab</w:t>
-      </w:r>
-      <w:proofErr w:type="spellEnd"/>
-      <w:r>
-        <w:t>, .NET Core, and Git.</w:t>
+        <w:rPr/>
+      </w:pPr>
+      <w:r>
+        <w:rPr/>
+        <w:t>Used knowledge of 3D math to develop an outline shader system in Unity3D using C#, ShaderLab, .NET Core, and Git.</w:t>
       </w:r>
     </w:p>
     <w:p>
@@ -491,46 +461,125 @@
           <w:ilvl w:val="0"/>
           <w:numId w:val="4"/>
         </w:numPr>
-      </w:pPr>
-      <w:r>
+        <w:rPr/>
+      </w:pPr>
+      <w:r>
+        <w:rPr/>
         <w:t>Achieved 12,000+ downloads overall.</w:t>
       </w:r>
     </w:p>
     <w:p>
       <w:pPr>
         <w:pStyle w:val="Heading1"/>
-      </w:pPr>
-      <w:r>
+        <w:rPr/>
+      </w:pPr>
+      <w:r>
+        <w:rPr/>
         <w:t>Education</w:t>
       </w:r>
     </w:p>
     <w:p>
       <w:pPr>
         <w:pStyle w:val="Heading3"/>
+        <w:rPr/>
       </w:pPr>
       <w:r>
         <w:rPr>
-          <w:b w:val="0"/>
+          <w:b w:val="false"/>
         </w:rPr>
-        <w:t>High School Diploma - Walter Johnson High School</w:t>
-      </w:r>
+        <w:t>High School Diploma - Walter Johnson High School, Bethesda, MD</w:t>
+      </w:r>
+      <w:r>
+        <w:rPr/>
+        <w:tab/>
+        <w:t>June 2017</w:t>
+      </w:r>
+    </w:p>
+    <w:p>
+      <w:pPr>
+        <w:pStyle w:val="ListParagraph"/>
+        <w:numPr>
+          <w:ilvl w:val="0"/>
+          <w:numId w:val="5"/>
+        </w:numPr>
+        <w:rPr/>
+      </w:pPr>
+      <w:r>
+        <w:rPr/>
+        <w:t>Took AP Computer Science and the more advanced course, Computer Science 3, focusing on computer architecture, algorithms, and complex data structures in object-oriented programming</w:t>
+      </w:r>
+    </w:p>
+    <w:p>
+      <w:pPr>
+        <w:pStyle w:val="ListParagraph"/>
+        <w:numPr>
+          <w:ilvl w:val="0"/>
+          <w:numId w:val="5"/>
+        </w:numPr>
+        <w:rPr/>
+      </w:pPr>
+      <w:r>
+        <w:rPr/>
+        <w:t>Scored fives on the AP Computer Science and AP Physics tests</w:t>
+      </w:r>
+    </w:p>
+    <w:p>
+      <w:pPr>
+        <w:pStyle w:val="ListParagraph"/>
+        <w:numPr>
+          <w:ilvl w:val="0"/>
+          <w:numId w:val="5"/>
+        </w:numPr>
+        <w:rPr/>
+      </w:pPr>
+      <w:r>
+        <w:rPr/>
+        <w:t>Unweighted/Weighted GPA: 3.83/4.31</w:t>
+      </w:r>
+    </w:p>
+    <w:p>
+      <w:pPr>
+        <w:pStyle w:val="ListParagraph"/>
+        <w:numPr>
+          <w:ilvl w:val="0"/>
+          <w:numId w:val="5"/>
+        </w:numPr>
+        <w:rPr/>
+      </w:pPr>
+      <w:r>
+        <w:rPr/>
+        <w:t>Carnegie Mellon National High School Game Academy Pre-College Program (Pittsburgh, PA, Summer 2016)</w:t>
+      </w:r>
+    </w:p>
+    <w:p>
+      <w:pPr>
+        <w:pStyle w:val="Heading1"/>
+        <w:rPr/>
+      </w:pPr>
+      <w:r>
+        <w:rPr/>
+        <w:t>Skills</w:t>
+      </w:r>
+    </w:p>
+    <w:p>
+      <w:pPr>
+        <w:pStyle w:val="ListParagraph"/>
+        <w:numPr>
+          <w:ilvl w:val="0"/>
+          <w:numId w:val="5"/>
+        </w:numPr>
+        <w:rPr/>
+      </w:pPr>
       <w:r>
         <w:rPr>
-          <w:b w:val="0"/>
+          <w:b/>
+          <w:bCs/>
         </w:rPr>
-        <w:t>, Bethesda, MD</w:t>
-      </w:r>
-      <w:r>
-        <w:tab/>
-      </w:r>
-      <w:r>
-        <w:t xml:space="preserve">June </w:t>
-      </w:r>
-      <w:r>
-        <w:t>201</w:t>
-      </w:r>
-      <w:r>
-        <w:t>7</w:t>
+        <w:t>Front-End Development:</w:t>
+      </w:r>
+      <w:r>
+        <w:rPr/>
+        <w:t xml:space="preserve"> UI/UX Design, TypeScript, JavaScript, React.js, Node.js, Jest, jQuery, Ajax, HTML, CSS, SASS</w:t>
       </w:r>
     </w:p>
     <w:p>
@@ -540,33 +589,18 @@
           <w:ilvl w:val="0"/>
           <w:numId w:val="5"/>
         </w:numPr>
-      </w:pPr>
-      <w:r>
-        <w:t xml:space="preserve">Took AP Computer Science and </w:t>
-      </w:r>
-      <w:r>
-        <w:t>the</w:t>
-      </w:r>
-      <w:r>
-        <w:t xml:space="preserve"> more advance</w:t>
-      </w:r>
-      <w:r>
-        <w:t>d</w:t>
-      </w:r>
-      <w:r>
-        <w:t xml:space="preserve"> course</w:t>
-      </w:r>
-      <w:r>
-        <w:t xml:space="preserve">, </w:t>
-      </w:r>
-      <w:r>
-        <w:t>Computer Science 3</w:t>
-      </w:r>
-      <w:r>
-        <w:t>, f</w:t>
-      </w:r>
-      <w:r>
-        <w:t>ocusing on computer architecture, algorithms, and complex data structures in object-oriented programming</w:t>
+        <w:rPr/>
+      </w:pPr>
+      <w:r>
+        <w:rPr>
+          <w:b/>
+          <w:bCs/>
+        </w:rPr>
+        <w:t>Back-End Development:</w:t>
+      </w:r>
+      <w:r>
+        <w:rPr/>
+        <w:t xml:space="preserve"> Distributed System Design, SQL, NoSQL, Java, Python, Golang, C#, .NET, Spring</w:t>
       </w:r>
     </w:p>
     <w:p>
@@ -576,17 +610,18 @@
           <w:ilvl w:val="0"/>
           <w:numId w:val="5"/>
         </w:numPr>
-      </w:pPr>
-      <w:r>
-        <w:t xml:space="preserve">Scored </w:t>
-      </w:r>
-      <w:proofErr w:type="spellStart"/>
-      <w:r>
-        <w:t>fives</w:t>
-      </w:r>
-      <w:proofErr w:type="spellEnd"/>
-      <w:r>
-        <w:t xml:space="preserve"> on the AP Computer Science and AP Physics tests</w:t>
+        <w:rPr/>
+      </w:pPr>
+      <w:r>
+        <w:rPr>
+          <w:b/>
+          <w:bCs/>
+        </w:rPr>
+        <w:t>Game Development:</w:t>
+      </w:r>
+      <w:r>
+        <w:rPr/>
+        <w:t xml:space="preserve"> Unity3D, ShaderLab</w:t>
       </w:r>
     </w:p>
     <w:p>
@@ -596,9 +631,18 @@
           <w:ilvl w:val="0"/>
           <w:numId w:val="5"/>
         </w:numPr>
-      </w:pPr>
-      <w:r>
-        <w:t>Unweighted/Weighted GPA: 3.83/4.31</w:t>
+        <w:rPr/>
+      </w:pPr>
+      <w:r>
+        <w:rPr>
+          <w:b/>
+          <w:bCs/>
+        </w:rPr>
+        <w:t>Networking &amp; Protocols:</w:t>
+      </w:r>
+      <w:r>
+        <w:rPr/>
+        <w:t xml:space="preserve"> UDP, TCP, HTTP, HTTPS, SSH, DNS, TLS, RESTful APIs</w:t>
       </w:r>
     </w:p>
     <w:p>
@@ -608,20 +652,18 @@
           <w:ilvl w:val="0"/>
           <w:numId w:val="5"/>
         </w:numPr>
-      </w:pPr>
-      <w:r>
-        <w:t>Carnegie Mellon National High School Game Academy Pre-College Program (Pittsburgh, PA</w:t>
-      </w:r>
-      <w:r>
-        <w:t>, Summer 2016)</w:t>
-      </w:r>
-    </w:p>
-    <w:p>
-      <w:pPr>
-        <w:pStyle w:val="Heading1"/>
-      </w:pPr>
-      <w:r>
-        <w:t>Skills</w:t>
+        <w:rPr/>
+      </w:pPr>
+      <w:r>
+        <w:rPr>
+          <w:b/>
+          <w:bCs/>
+        </w:rPr>
+        <w:t>Data Formats:</w:t>
+      </w:r>
+      <w:r>
+        <w:rPr/>
+        <w:t xml:space="preserve"> JSON, XML, YAML</w:t>
       </w:r>
     </w:p>
     <w:p>
@@ -631,9 +673,18 @@
           <w:ilvl w:val="0"/>
           <w:numId w:val="5"/>
         </w:numPr>
-      </w:pPr>
-      <w:r>
-        <w:t>UI and UX design; Distributed system design</w:t>
+        <w:rPr/>
+      </w:pPr>
+      <w:r>
+        <w:rPr>
+          <w:b/>
+          <w:bCs/>
+        </w:rPr>
+        <w:t>DevOps:</w:t>
+      </w:r>
+      <w:r>
+        <w:rPr/>
+        <w:t xml:space="preserve"> Build Pipelines, CI/CD, Automated Testing &amp; Deployment</w:t>
       </w:r>
     </w:p>
     <w:p>
@@ -643,9 +694,18 @@
           <w:ilvl w:val="0"/>
           <w:numId w:val="5"/>
         </w:numPr>
-      </w:pPr>
-      <w:r>
-        <w:t>Full stack development and game development</w:t>
+        <w:rPr/>
+      </w:pPr>
+      <w:r>
+        <w:rPr>
+          <w:b/>
+          <w:bCs/>
+        </w:rPr>
+        <w:t>Cloud &amp; Enterprise Platforms:</w:t>
+      </w:r>
+      <w:r>
+        <w:rPr/>
+        <w:t xml:space="preserve"> AWS, Azure, GCP, Microsoft Dynamics, PowerApps, SharePoint</w:t>
       </w:r>
     </w:p>
     <w:p>
@@ -655,110 +715,38 @@
           <w:ilvl w:val="0"/>
           <w:numId w:val="5"/>
         </w:numPr>
-      </w:pPr>
-      <w:r>
-        <w:t xml:space="preserve">C#, .NET, </w:t>
-      </w:r>
-      <w:proofErr w:type="spellStart"/>
-      <w:r>
-        <w:t>ShaderLab</w:t>
-      </w:r>
-      <w:proofErr w:type="spellEnd"/>
-      <w:r>
-        <w:t xml:space="preserve">, Golang, Java, </w:t>
-      </w:r>
-      <w:r>
-        <w:t xml:space="preserve">Python, </w:t>
-      </w:r>
-      <w:r>
-        <w:t>HTML, SASS, CSS, SQL, PHP, TypeScript, and JavaScript</w:t>
-      </w:r>
-    </w:p>
-    <w:p>
-      <w:pPr>
-        <w:pStyle w:val="ListParagraph"/>
-        <w:numPr>
-          <w:ilvl w:val="0"/>
-          <w:numId w:val="5"/>
-        </w:numPr>
-      </w:pPr>
-      <w:r>
-        <w:t xml:space="preserve">Git, Docker, Spring, Microsoft Word, Microsoft Excel, LibreOffice Calc, Microsoft Visual Studio, Microsoft Visual Studio Code, Adobe Photoshop, Wix, </w:t>
-      </w:r>
-      <w:proofErr w:type="spellStart"/>
-      <w:r>
-        <w:t>Wordpress</w:t>
-      </w:r>
-      <w:proofErr w:type="spellEnd"/>
-      <w:r>
-        <w:t>, Divi, Node.js, Jest, jQuery, Ajax, React.js, and Unity3D</w:t>
-      </w:r>
-    </w:p>
-    <w:p>
-      <w:pPr>
-        <w:pStyle w:val="ListParagraph"/>
-        <w:numPr>
-          <w:ilvl w:val="0"/>
-          <w:numId w:val="5"/>
-        </w:numPr>
-      </w:pPr>
-      <w:r>
-        <w:t>Cloud services, including Microsoft Dynamics, PowerApps, SharePoint, AWS, GCP, and Azure</w:t>
-      </w:r>
-    </w:p>
-    <w:p>
-      <w:pPr>
-        <w:pStyle w:val="ListParagraph"/>
-        <w:numPr>
-          <w:ilvl w:val="0"/>
-          <w:numId w:val="5"/>
-        </w:numPr>
-      </w:pPr>
-      <w:r>
-        <w:t>Databases, including SQL and NoSQL</w:t>
-      </w:r>
-    </w:p>
-    <w:p>
-      <w:pPr>
-        <w:pStyle w:val="ListParagraph"/>
-        <w:numPr>
-          <w:ilvl w:val="0"/>
-          <w:numId w:val="5"/>
-        </w:numPr>
-      </w:pPr>
-      <w:r>
-        <w:t>UDP, TCP, HTTP, HTTPS, SSH, DNS, TLS, CI/CD, JSON, XML, YAML, and RESTful APIs</w:t>
-      </w:r>
-    </w:p>
-    <w:p>
-      <w:pPr>
-        <w:pStyle w:val="ListParagraph"/>
-        <w:numPr>
-          <w:ilvl w:val="0"/>
-          <w:numId w:val="5"/>
-        </w:numPr>
-      </w:pPr>
-      <w:r>
-        <w:t>Build pipelines</w:t>
+        <w:spacing w:before="0" w:after="160"/>
+        <w:contextualSpacing/>
+        <w:rPr/>
+      </w:pPr>
+      <w:r>
+        <w:rPr>
+          <w:b/>
+          <w:bCs/>
+        </w:rPr>
+        <w:t>Tools:</w:t>
+      </w:r>
+      <w:r>
+        <w:rPr/>
+        <w:t xml:space="preserve"> Git, Docker, Microsoft Visual Studio, Microsoft Visual Studio Code, Adobe Photoshop</w:t>
       </w:r>
     </w:p>
     <w:sectPr>
+      <w:type w:val="nextPage"/>
       <w:pgSz w:w="12240" w:h="15840"/>
-      <w:pgMar w:top="720" w:right="1080" w:bottom="720" w:left="1080" w:header="0" w:footer="0" w:gutter="0"/>
-      <w:cols w:space="720"/>
-      <w:formProt w:val="0"/>
-      <w:docGrid w:linePitch="360" w:charSpace="4096"/>
+      <w:pgMar w:left="1080" w:right="1080" w:gutter="0" w:header="0" w:top="720" w:footer="0" w:bottom="720"/>
+      <w:pgNumType w:fmt="decimal"/>
+      <w:formProt w:val="false"/>
+      <w:textDirection w:val="lrTb"/>
+      <w:docGrid w:type="default" w:linePitch="360" w:charSpace="12288"/>
     </w:sectPr>
   </w:body>
 </w:document>
 </file>
 
 <file path=word/numbering.xml><?xml version="1.0" encoding="utf-8"?>
-<w:numbering xmlns:wpc="http://schemas.microsoft.com/office/word/2010/wordprocessingCanvas" xmlns:cx="http://schemas.microsoft.com/office/drawing/2014/chartex" xmlns:cx1="http://schemas.microsoft.com/office/drawing/2015/9/8/chartex" xmlns:cx2="http://schemas.microsoft.com/office/drawing/2015/10/21/chartex" xmlns:cx3="http://schemas.microsoft.com/office/drawing/2016/5/9/chartex" xmlns:cx4="http://schemas.microsoft.com/office/drawing/2016/5/10/chartex" xmlns:cx5="http://schemas.microsoft.com/office/drawing/2016/5/11/chartex" xmlns:cx6="http://schemas.microsoft.com/office/drawing/2016/5/12/chartex" xmlns:cx7="http://schemas.microsoft.com/office/drawing/2016/5/13/chartex" xmlns:cx8="http://schemas.microsoft.com/office/drawing/2016/5/14/chartex" xmlns:mc="http://schemas.openxmlformats.org/markup-compatibility/2006" xmlns:aink="http://schemas.microsoft.com/office/drawing/2016/ink" xmlns:am3d="http://schemas.microsoft.com/office/drawing/2017/model3d" xmlns:o="urn:schemas-microsoft-com:office:office" xmlns:oel="http://schemas.microsoft.com/office/2019/extlst" xmlns:r="http://schemas.openxmlformats.org/officeDocument/2006/relationships" xmlns:m="http://schemas.openxmlformats.org/officeDocument/2006/math" xmlns:v="urn:schemas-microsoft-com:vml" xmlns:wp14="http://schemas.microsoft.com/office/word/2010/wordprocessingDrawing" xmlns:wp="http://schemas.openxmlformats.org/drawingml/2006/wordprocessingDrawing" xmlns:w10="urn:schemas-microsoft-com:office:word" xmlns:w="http://schemas.openxmlformats.org/wordprocessingml/2006/main" xmlns:w14="http://schemas.microsoft.com/office/word/2010/wordml" xmlns:w15="http://schemas.microsoft.com/office/word/2012/wordml" xmlns:w16cei="http://schemas.microsoft.com/office/word/2026/wordml/cei" xmlns:w16cex="http://schemas.microsoft.com/office/word/2018/wordml/cex" xmlns:w16cid="http://schemas.microsoft.com/office/word/2016/wordml/cid" xmlns:w16="http://schemas.microsoft.com/office/word/2018/wordml" xmlns:w16du="http://schemas.microsoft.com/office/word/2023/wordml/word16du" xmlns:w16sdtdh="http://schemas.microsoft.com/office/word/2020/wordml/sdtdatahash" xmlns:w16sdtfl="http://schemas.microsoft.com/office/word/2024/wordml/sdtformatlock" xmlns:w16se="http://schemas.microsoft.com/office/word/2015/wordml/symex" xmlns:wpg="http://schemas.microsoft.com/office/word/2010/wordprocessingGroup" xmlns:wpi="http://schemas.microsoft.com/office/word/2010/wordprocessingInk" xmlns:wne="http://schemas.microsoft.com/office/word/2006/wordml" xmlns:wps="http://schemas.microsoft.com/office/word/2010/wordprocessingShape" mc:Ignorable="w14 w15 w16se w16cid w16 w16cex w16sdtdh w16sdtfl w16du wp14">
-  <w:abstractNum w:abstractNumId="0" w15:restartNumberingAfterBreak="0">
-    <w:nsid w:val="0A115121"/>
-    <w:multiLevelType w:val="multilevel"/>
-    <w:tmpl w:val="512EDAA8"/>
+<w:numbering xmlns:w="http://schemas.openxmlformats.org/wordprocessingml/2006/main" xmlns:o="urn:schemas-microsoft-com:office:office" xmlns:r="http://schemas.openxmlformats.org/officeDocument/2006/relationships" xmlns:v="urn:schemas-microsoft-com:vml" xmlns:mc="http://schemas.openxmlformats.org/markup-compatibility/2006" xmlns:w14="http://schemas.microsoft.com/office/word/2010/wordml" mc:Ignorable="w14">
+  <w:abstractNum w:abstractNumId="1">
     <w:lvl w:ilvl="0">
       <w:start w:val="1"/>
       <w:numFmt w:val="bullet"/>
@@ -895,10 +883,7 @@
       </w:rPr>
     </w:lvl>
   </w:abstractNum>
-  <w:abstractNum w:abstractNumId="1" w15:restartNumberingAfterBreak="0">
-    <w:nsid w:val="26485136"/>
-    <w:multiLevelType w:val="multilevel"/>
-    <w:tmpl w:val="8242A968"/>
+  <w:abstractNum w:abstractNumId="2">
     <w:lvl w:ilvl="0">
       <w:start w:val="1"/>
       <w:numFmt w:val="bullet"/>
@@ -1035,10 +1020,7 @@
       </w:rPr>
     </w:lvl>
   </w:abstractNum>
-  <w:abstractNum w:abstractNumId="2" w15:restartNumberingAfterBreak="0">
-    <w:nsid w:val="46F32BB9"/>
-    <w:multiLevelType w:val="multilevel"/>
-    <w:tmpl w:val="436255F8"/>
+  <w:abstractNum w:abstractNumId="3">
     <w:lvl w:ilvl="0">
       <w:start w:val="1"/>
       <w:numFmt w:val="bullet"/>
@@ -1175,10 +1157,7 @@
       </w:rPr>
     </w:lvl>
   </w:abstractNum>
-  <w:abstractNum w:abstractNumId="3" w15:restartNumberingAfterBreak="0">
-    <w:nsid w:val="486174BF"/>
-    <w:multiLevelType w:val="multilevel"/>
-    <w:tmpl w:val="1A048EF6"/>
+  <w:abstractNum w:abstractNumId="4">
     <w:lvl w:ilvl="0">
       <w:start w:val="1"/>
       <w:numFmt w:val="bullet"/>
@@ -1315,10 +1294,7 @@
       </w:rPr>
     </w:lvl>
   </w:abstractNum>
-  <w:abstractNum w:abstractNumId="4" w15:restartNumberingAfterBreak="0">
-    <w:nsid w:val="57E64886"/>
-    <w:multiLevelType w:val="multilevel"/>
-    <w:tmpl w:val="ED28A52E"/>
+  <w:abstractNum w:abstractNumId="5">
     <w:lvl w:ilvl="0">
       <w:start w:val="1"/>
       <w:numFmt w:val="bullet"/>
@@ -1455,10 +1431,7 @@
       </w:rPr>
     </w:lvl>
   </w:abstractNum>
-  <w:abstractNum w:abstractNumId="5" w15:restartNumberingAfterBreak="0">
-    <w:nsid w:val="5C700C0B"/>
-    <w:multiLevelType w:val="multilevel"/>
-    <w:tmpl w:val="5D001EB4"/>
+  <w:abstractNum w:abstractNumId="6">
     <w:lvl w:ilvl="0">
       <w:start w:val="1"/>
       <w:numFmt w:val="none"/>
@@ -1469,7 +1442,7 @@
         <w:tabs>
           <w:tab w:val="num" w:pos="0"/>
         </w:tabs>
-        <w:ind w:left="0" w:firstLine="0"/>
+        <w:ind w:left="0" w:hanging="0"/>
       </w:pPr>
     </w:lvl>
     <w:lvl w:ilvl="1">
@@ -1482,7 +1455,7 @@
         <w:tabs>
           <w:tab w:val="num" w:pos="0"/>
         </w:tabs>
-        <w:ind w:left="0" w:firstLine="0"/>
+        <w:ind w:left="0" w:hanging="0"/>
       </w:pPr>
     </w:lvl>
     <w:lvl w:ilvl="2">
@@ -1495,7 +1468,7 @@
         <w:tabs>
           <w:tab w:val="num" w:pos="0"/>
         </w:tabs>
-        <w:ind w:left="0" w:firstLine="0"/>
+        <w:ind w:left="0" w:hanging="0"/>
       </w:pPr>
     </w:lvl>
     <w:lvl w:ilvl="3">
@@ -1508,7 +1481,7 @@
         <w:tabs>
           <w:tab w:val="num" w:pos="0"/>
         </w:tabs>
-        <w:ind w:left="0" w:firstLine="0"/>
+        <w:ind w:left="0" w:hanging="0"/>
       </w:pPr>
     </w:lvl>
     <w:lvl w:ilvl="4">
@@ -1521,7 +1494,7 @@
         <w:tabs>
           <w:tab w:val="num" w:pos="0"/>
         </w:tabs>
-        <w:ind w:left="0" w:firstLine="0"/>
+        <w:ind w:left="0" w:hanging="0"/>
       </w:pPr>
     </w:lvl>
     <w:lvl w:ilvl="5">
@@ -1534,7 +1507,7 @@
         <w:tabs>
           <w:tab w:val="num" w:pos="0"/>
         </w:tabs>
-        <w:ind w:left="0" w:firstLine="0"/>
+        <w:ind w:left="0" w:hanging="0"/>
       </w:pPr>
     </w:lvl>
     <w:lvl w:ilvl="6">
@@ -1547,7 +1520,7 @@
         <w:tabs>
           <w:tab w:val="num" w:pos="0"/>
         </w:tabs>
-        <w:ind w:left="0" w:firstLine="0"/>
+        <w:ind w:left="0" w:hanging="0"/>
       </w:pPr>
     </w:lvl>
     <w:lvl w:ilvl="7">
@@ -1560,7 +1533,7 @@
         <w:tabs>
           <w:tab w:val="num" w:pos="0"/>
         </w:tabs>
-        <w:ind w:left="0" w:firstLine="0"/>
+        <w:ind w:left="0" w:hanging="0"/>
       </w:pPr>
     </w:lvl>
     <w:lvl w:ilvl="8">
@@ -1573,37 +1546,37 @@
         <w:tabs>
           <w:tab w:val="num" w:pos="0"/>
         </w:tabs>
-        <w:ind w:left="0" w:firstLine="0"/>
+        <w:ind w:left="0" w:hanging="0"/>
       </w:pPr>
     </w:lvl>
   </w:abstractNum>
-  <w:num w:numId="1" w16cid:durableId="383019685">
+  <w:num w:numId="1">
+    <w:abstractNumId w:val="1"/>
+  </w:num>
+  <w:num w:numId="2">
     <w:abstractNumId w:val="2"/>
   </w:num>
-  <w:num w:numId="2" w16cid:durableId="370493776">
-    <w:abstractNumId w:val="0"/>
-  </w:num>
-  <w:num w:numId="3" w16cid:durableId="310017338">
+  <w:num w:numId="3">
     <w:abstractNumId w:val="3"/>
   </w:num>
-  <w:num w:numId="4" w16cid:durableId="544222795">
+  <w:num w:numId="4">
     <w:abstractNumId w:val="4"/>
   </w:num>
-  <w:num w:numId="5" w16cid:durableId="386532973">
-    <w:abstractNumId w:val="1"/>
+  <w:num w:numId="5">
+    <w:abstractNumId w:val="5"/>
   </w:num>
-  <w:num w:numId="6" w16cid:durableId="47076528">
-    <w:abstractNumId w:val="5"/>
+  <w:num w:numId="6">
+    <w:abstractNumId w:val="6"/>
   </w:num>
 </w:numbering>
 </file>
 
 <file path=word/styles.xml><?xml version="1.0" encoding="utf-8"?>
-<w:styles xmlns:mc="http://schemas.openxmlformats.org/markup-compatibility/2006" xmlns:r="http://schemas.openxmlformats.org/officeDocument/2006/relationships" xmlns:w="http://schemas.openxmlformats.org/wordprocessingml/2006/main" xmlns:w14="http://schemas.microsoft.com/office/word/2010/wordml" xmlns:w15="http://schemas.microsoft.com/office/word/2012/wordml" xmlns:w16cex="http://schemas.microsoft.com/office/word/2018/wordml/cex" xmlns:w16cid="http://schemas.microsoft.com/office/word/2016/wordml/cid" xmlns:w16="http://schemas.microsoft.com/office/word/2018/wordml" xmlns:w16du="http://schemas.microsoft.com/office/word/2023/wordml/word16du" xmlns:w16sdtdh="http://schemas.microsoft.com/office/word/2020/wordml/sdtdatahash" xmlns:w16sdtfl="http://schemas.microsoft.com/office/word/2024/wordml/sdtformatlock" xmlns:w16se="http://schemas.microsoft.com/office/word/2015/wordml/symex" mc:Ignorable="w14 w15 w16se w16cid w16 w16cex w16sdtdh w16sdtfl w16du">
+<w:styles xmlns:w="http://schemas.openxmlformats.org/wordprocessingml/2006/main" xmlns:w14="http://schemas.microsoft.com/office/word/2010/wordml" xmlns:mc="http://schemas.openxmlformats.org/markup-compatibility/2006" mc:Ignorable="w14">
   <w:docDefaults>
     <w:rPrDefault>
       <w:rPr>
-        <w:rFonts w:asciiTheme="minorHAnsi" w:eastAsiaTheme="minorHAnsi" w:hAnsiTheme="minorHAnsi" w:cstheme="minorBidi"/>
+        <w:rFonts w:ascii="Calibri" w:hAnsi="Calibri" w:eastAsia="Calibri" w:cs="" w:asciiTheme="minorHAnsi" w:cstheme="minorBidi" w:eastAsiaTheme="minorHAnsi" w:hAnsiTheme="minorHAnsi"/>
         <w:kern w:val="2"/>
         <w:sz w:val="22"/>
         <w:szCs w:val="22"/>
@@ -1613,21 +1586,21 @@
     </w:rPrDefault>
     <w:pPrDefault>
       <w:pPr>
-        <w:suppressAutoHyphens/>
+        <w:suppressAutoHyphens w:val="true"/>
       </w:pPr>
     </w:pPrDefault>
   </w:docDefaults>
   <w:latentStyles w:defLockedState="0" w:defUIPriority="99" w:defSemiHidden="0" w:defUnhideWhenUsed="0" w:defQFormat="0" w:count="376">
     <w:lsdException w:name="Normal" w:uiPriority="0" w:qFormat="1"/>
     <w:lsdException w:name="heading 1" w:uiPriority="9" w:qFormat="1"/>
-    <w:lsdException w:name="heading 2" w:semiHidden="1" w:uiPriority="9" w:unhideWhenUsed="1" w:qFormat="1"/>
-    <w:lsdException w:name="heading 3" w:semiHidden="1" w:uiPriority="9" w:unhideWhenUsed="1" w:qFormat="1"/>
-    <w:lsdException w:name="heading 4" w:semiHidden="1" w:uiPriority="9" w:unhideWhenUsed="1" w:qFormat="1"/>
-    <w:lsdException w:name="heading 5" w:semiHidden="1" w:uiPriority="9" w:unhideWhenUsed="1" w:qFormat="1"/>
-    <w:lsdException w:name="heading 6" w:semiHidden="1" w:uiPriority="9" w:unhideWhenUsed="1" w:qFormat="1"/>
-    <w:lsdException w:name="heading 7" w:semiHidden="1" w:uiPriority="9" w:unhideWhenUsed="1" w:qFormat="1"/>
-    <w:lsdException w:name="heading 8" w:semiHidden="1" w:uiPriority="9" w:unhideWhenUsed="1" w:qFormat="1"/>
-    <w:lsdException w:name="heading 9" w:semiHidden="1" w:uiPriority="9" w:unhideWhenUsed="1" w:qFormat="1"/>
+    <w:lsdException w:name="heading 2" w:uiPriority="9" w:semiHidden="1" w:unhideWhenUsed="1" w:qFormat="1"/>
+    <w:lsdException w:name="heading 3" w:uiPriority="9" w:semiHidden="1" w:unhideWhenUsed="1" w:qFormat="1"/>
+    <w:lsdException w:name="heading 4" w:uiPriority="9" w:semiHidden="1" w:unhideWhenUsed="1" w:qFormat="1"/>
+    <w:lsdException w:name="heading 5" w:uiPriority="9" w:semiHidden="1" w:unhideWhenUsed="1" w:qFormat="1"/>
+    <w:lsdException w:name="heading 6" w:uiPriority="9" w:semiHidden="1" w:unhideWhenUsed="1" w:qFormat="1"/>
+    <w:lsdException w:name="heading 7" w:uiPriority="9" w:semiHidden="1" w:unhideWhenUsed="1" w:qFormat="1"/>
+    <w:lsdException w:name="heading 8" w:uiPriority="9" w:semiHidden="1" w:unhideWhenUsed="1" w:qFormat="1"/>
+    <w:lsdException w:name="heading 9" w:uiPriority="9" w:semiHidden="1" w:unhideWhenUsed="1" w:qFormat="1"/>
     <w:lsdException w:name="index 1" w:semiHidden="1" w:unhideWhenUsed="1"/>
     <w:lsdException w:name="index 2" w:semiHidden="1" w:unhideWhenUsed="1"/>
     <w:lsdException w:name="index 3" w:semiHidden="1" w:unhideWhenUsed="1"/>
@@ -1637,22 +1610,22 @@
     <w:lsdException w:name="index 7" w:semiHidden="1" w:unhideWhenUsed="1"/>
     <w:lsdException w:name="index 8" w:semiHidden="1" w:unhideWhenUsed="1"/>
     <w:lsdException w:name="index 9" w:semiHidden="1" w:unhideWhenUsed="1"/>
-    <w:lsdException w:name="toc 1" w:semiHidden="1" w:uiPriority="39" w:unhideWhenUsed="1"/>
-    <w:lsdException w:name="toc 2" w:semiHidden="1" w:uiPriority="39" w:unhideWhenUsed="1"/>
-    <w:lsdException w:name="toc 3" w:semiHidden="1" w:uiPriority="39" w:unhideWhenUsed="1"/>
-    <w:lsdException w:name="toc 4" w:semiHidden="1" w:uiPriority="39" w:unhideWhenUsed="1"/>
-    <w:lsdException w:name="toc 5" w:semiHidden="1" w:uiPriority="39" w:unhideWhenUsed="1"/>
-    <w:lsdException w:name="toc 6" w:semiHidden="1" w:uiPriority="39" w:unhideWhenUsed="1"/>
-    <w:lsdException w:name="toc 7" w:semiHidden="1" w:uiPriority="39" w:unhideWhenUsed="1"/>
-    <w:lsdException w:name="toc 8" w:semiHidden="1" w:uiPriority="39" w:unhideWhenUsed="1"/>
-    <w:lsdException w:name="toc 9" w:semiHidden="1" w:uiPriority="39" w:unhideWhenUsed="1"/>
+    <w:lsdException w:name="toc 1" w:uiPriority="39" w:semiHidden="1" w:unhideWhenUsed="1"/>
+    <w:lsdException w:name="toc 2" w:uiPriority="39" w:semiHidden="1" w:unhideWhenUsed="1"/>
+    <w:lsdException w:name="toc 3" w:uiPriority="39" w:semiHidden="1" w:unhideWhenUsed="1"/>
+    <w:lsdException w:name="toc 4" w:uiPriority="39" w:semiHidden="1" w:unhideWhenUsed="1"/>
+    <w:lsdException w:name="toc 5" w:uiPriority="39" w:semiHidden="1" w:unhideWhenUsed="1"/>
+    <w:lsdException w:name="toc 6" w:uiPriority="39" w:semiHidden="1" w:unhideWhenUsed="1"/>
+    <w:lsdException w:name="toc 7" w:uiPriority="39" w:semiHidden="1" w:unhideWhenUsed="1"/>
+    <w:lsdException w:name="toc 8" w:uiPriority="39" w:semiHidden="1" w:unhideWhenUsed="1"/>
+    <w:lsdException w:name="toc 9" w:uiPriority="39" w:semiHidden="1" w:unhideWhenUsed="1"/>
     <w:lsdException w:name="Normal Indent" w:semiHidden="1" w:unhideWhenUsed="1"/>
     <w:lsdException w:name="footnote text" w:semiHidden="1" w:unhideWhenUsed="1"/>
     <w:lsdException w:name="annotation text" w:semiHidden="1" w:unhideWhenUsed="1"/>
     <w:lsdException w:name="header" w:semiHidden="1" w:unhideWhenUsed="1"/>
     <w:lsdException w:name="footer" w:semiHidden="1" w:unhideWhenUsed="1"/>
     <w:lsdException w:name="index heading" w:semiHidden="1" w:unhideWhenUsed="1"/>
-    <w:lsdException w:name="caption" w:semiHidden="1" w:uiPriority="35" w:unhideWhenUsed="1" w:qFormat="1"/>
+    <w:lsdException w:name="caption" w:uiPriority="35" w:semiHidden="1" w:unhideWhenUsed="1" w:qFormat="1"/>
     <w:lsdException w:name="table of figures" w:semiHidden="1" w:unhideWhenUsed="1"/>
     <w:lsdException w:name="envelope address" w:semiHidden="1" w:unhideWhenUsed="1"/>
     <w:lsdException w:name="envelope return" w:semiHidden="1" w:unhideWhenUsed="1"/>
@@ -1683,7 +1656,7 @@
     <w:lsdException w:name="Title" w:uiPriority="10" w:qFormat="1"/>
     <w:lsdException w:name="Closing" w:semiHidden="1" w:unhideWhenUsed="1"/>
     <w:lsdException w:name="Signature" w:semiHidden="1" w:unhideWhenUsed="1"/>
-    <w:lsdException w:name="Default Paragraph Font" w:semiHidden="1" w:uiPriority="1" w:unhideWhenUsed="1"/>
+    <w:lsdException w:name="Default Paragraph Font" w:uiPriority="1" w:semiHidden="1" w:unhideWhenUsed="1"/>
     <w:lsdException w:name="Body Text" w:semiHidden="1" w:unhideWhenUsed="1"/>
     <w:lsdException w:name="Body Text Indent" w:semiHidden="1" w:unhideWhenUsed="1"/>
     <w:lsdException w:name="List Continue" w:semiHidden="1" w:unhideWhenUsed="1"/>
@@ -1883,8 +1856,8 @@
     <w:lsdException w:name="Subtle Reference" w:uiPriority="31" w:qFormat="1"/>
     <w:lsdException w:name="Intense Reference" w:uiPriority="32" w:qFormat="1"/>
     <w:lsdException w:name="Book Title" w:uiPriority="33" w:qFormat="1"/>
-    <w:lsdException w:name="Bibliography" w:semiHidden="1" w:uiPriority="37" w:unhideWhenUsed="1"/>
-    <w:lsdException w:name="TOC Heading" w:semiHidden="1" w:uiPriority="39" w:unhideWhenUsed="1" w:qFormat="1"/>
+    <w:lsdException w:name="Bibliography" w:uiPriority="37" w:semiHidden="1" w:unhideWhenUsed="1"/>
+    <w:lsdException w:name="TOC Heading" w:uiPriority="39" w:semiHidden="1" w:unhideWhenUsed="1" w:qFormat="1"/>
     <w:lsdException w:name="Plain Table 1" w:uiPriority="41"/>
     <w:lsdException w:name="Plain Table 2" w:uiPriority="42"/>
     <w:lsdException w:name="Plain Table 3" w:uiPriority="43"/>
@@ -1995,63 +1968,71 @@
     <w:lsdException w:name="Unresolved Mention" w:semiHidden="1" w:unhideWhenUsed="1"/>
     <w:lsdException w:name="Smart Link" w:semiHidden="1" w:unhideWhenUsed="1"/>
   </w:latentStyles>
-  <w:style w:type="paragraph" w:default="1" w:styleId="Normal">
+  <w:style w:type="paragraph" w:styleId="Normal" w:default="1">
     <w:name w:val="Normal"/>
     <w:qFormat/>
-    <w:rsid w:val="009A1BFD"/>
+    <w:rsid w:val="009a1bfd"/>
     <w:pPr>
-      <w:spacing w:after="160" w:line="259" w:lineRule="auto"/>
+      <w:widowControl/>
+      <w:suppressAutoHyphens w:val="true"/>
+      <w:bidi w:val="0"/>
+      <w:spacing w:lineRule="auto" w:line="259" w:before="0" w:after="160"/>
+      <w:jc w:val="left"/>
     </w:pPr>
     <w:rPr>
-      <w:rFonts w:ascii="Garamond" w:eastAsia="Calibri" w:hAnsi="Garamond"/>
+      <w:rFonts w:ascii="Garamond" w:hAnsi="Garamond" w:eastAsia="Calibri" w:cs=""/>
       <w:color w:val="2E3D50"/>
+      <w:kern w:val="2"/>
+      <w:sz w:val="22"/>
+      <w:szCs w:val="22"/>
+      <w:lang w:val="en-US" w:eastAsia="en-US" w:bidi="ar-SA"/>
     </w:rPr>
   </w:style>
   <w:style w:type="paragraph" w:styleId="Heading1">
-    <w:name w:val="heading 1"/>
+    <w:name w:val="Heading 1"/>
     <w:basedOn w:val="Normal"/>
     <w:next w:val="Normal"/>
     <w:link w:val="Heading1Char"/>
     <w:uiPriority w:val="9"/>
     <w:qFormat/>
-    <w:rsid w:val="00A33BAD"/>
+    <w:rsid w:val="00a33bad"/>
     <w:pPr>
-      <w:keepNext/>
+      <w:keepNext w:val="true"/>
       <w:keepLines/>
       <w:spacing w:before="240" w:after="0"/>
       <w:outlineLvl w:val="0"/>
     </w:pPr>
     <w:rPr>
-      <w:rFonts w:eastAsiaTheme="majorEastAsia" w:cstheme="majorBidi"/>
+      <w:rFonts w:eastAsia="" w:cs="" w:cstheme="majorBidi" w:eastAsiaTheme="majorEastAsia"/>
       <w:b/>
       <w:sz w:val="40"/>
       <w:szCs w:val="32"/>
     </w:rPr>
   </w:style>
   <w:style w:type="paragraph" w:styleId="Heading2">
-    <w:name w:val="heading 2"/>
+    <w:name w:val="Heading 2"/>
     <w:basedOn w:val="Normal"/>
     <w:next w:val="Normal"/>
     <w:link w:val="Heading2Char"/>
     <w:uiPriority w:val="9"/>
     <w:unhideWhenUsed/>
     <w:qFormat/>
-    <w:rsid w:val="00DE72AF"/>
+    <w:rsid w:val="00de72af"/>
     <w:pPr>
-      <w:keepNext/>
+      <w:keepNext w:val="true"/>
       <w:keepLines/>
       <w:spacing w:before="158" w:after="0"/>
       <w:outlineLvl w:val="1"/>
     </w:pPr>
     <w:rPr>
-      <w:rFonts w:eastAsiaTheme="majorEastAsia" w:cstheme="majorBidi"/>
+      <w:rFonts w:eastAsia="" w:cs="" w:cstheme="majorBidi" w:eastAsiaTheme="majorEastAsia"/>
       <w:b/>
       <w:sz w:val="32"/>
       <w:szCs w:val="26"/>
     </w:rPr>
   </w:style>
   <w:style w:type="paragraph" w:styleId="Heading3">
-    <w:name w:val="heading 3"/>
+    <w:name w:val="Heading 3"/>
     <w:basedOn w:val="Normal"/>
     <w:next w:val="Normal"/>
     <w:link w:val="Heading3Char"/>
@@ -2060,61 +2041,44 @@
     <w:qFormat/>
     <w:rsid w:val="00892277"/>
     <w:pPr>
-      <w:keepNext/>
+      <w:keepNext w:val="true"/>
       <w:keepLines/>
       <w:tabs>
-        <w:tab w:val="right" w:pos="10080"/>
+        <w:tab w:val="clear" w:pos="720"/>
+        <w:tab w:val="right" w:pos="10080" w:leader="none"/>
       </w:tabs>
-      <w:spacing w:after="0"/>
+      <w:spacing w:before="0" w:after="0"/>
       <w:outlineLvl w:val="2"/>
     </w:pPr>
     <w:rPr>
-      <w:rFonts w:eastAsiaTheme="majorEastAsia" w:cstheme="majorBidi"/>
+      <w:rFonts w:eastAsia="" w:cs="" w:cstheme="majorBidi" w:eastAsiaTheme="majorEastAsia"/>
       <w:b/>
       <w:szCs w:val="24"/>
     </w:rPr>
   </w:style>
-  <w:style w:type="character" w:default="1" w:styleId="DefaultParagraphFont">
+  <w:style w:type="character" w:styleId="DefaultParagraphFont" w:default="1">
     <w:name w:val="Default Paragraph Font"/>
     <w:uiPriority w:val="1"/>
     <w:semiHidden/>
     <w:unhideWhenUsed/>
-  </w:style>
-  <w:style w:type="table" w:default="1" w:styleId="TableNormal">
-    <w:name w:val="Normal Table"/>
-    <w:uiPriority w:val="99"/>
-    <w:semiHidden/>
-    <w:unhideWhenUsed/>
-    <w:tblPr>
-      <w:tblInd w:w="0" w:type="dxa"/>
-      <w:tblCellMar>
-        <w:top w:w="0" w:type="dxa"/>
-        <w:left w:w="108" w:type="dxa"/>
-        <w:bottom w:w="0" w:type="dxa"/>
-        <w:right w:w="108" w:type="dxa"/>
-      </w:tblCellMar>
-    </w:tblPr>
-  </w:style>
-  <w:style w:type="numbering" w:default="1" w:styleId="NoList">
-    <w:name w:val="No List"/>
-    <w:uiPriority w:val="99"/>
-    <w:semiHidden/>
-    <w:unhideWhenUsed/>
-  </w:style>
-  <w:style w:type="character" w:customStyle="1" w:styleId="contact-item">
+    <w:qFormat/>
+    <w:rPr/>
+  </w:style>
+  <w:style w:type="character" w:styleId="contact-item" w:customStyle="1">
     <w:name w:val="contact-item"/>
     <w:basedOn w:val="DefaultParagraphFont"/>
     <w:qFormat/>
-    <w:rsid w:val="00CA5122"/>
+    <w:rsid w:val="00ca5122"/>
+    <w:rPr/>
   </w:style>
   <w:style w:type="character" w:styleId="Hyperlink">
     <w:name w:val="Hyperlink"/>
     <w:basedOn w:val="DefaultParagraphFont"/>
     <w:uiPriority w:val="99"/>
     <w:unhideWhenUsed/>
-    <w:rsid w:val="00CA5122"/>
+    <w:rsid w:val="00ca5122"/>
     <w:rPr>
-      <w:color w:val="0563C1" w:themeColor="hyperlink"/>
+      <w:color w:themeColor="hyperlink" w:val="0563C1"/>
       <w:u w:val="single"/>
     </w:rPr>
   </w:style>
@@ -2125,21 +2089,21 @@
     <w:semiHidden/>
     <w:unhideWhenUsed/>
     <w:qFormat/>
-    <w:rsid w:val="00CA5122"/>
+    <w:rsid w:val="00ca5122"/>
     <w:rPr>
       <w:color w:val="605E5C"/>
-      <w:shd w:val="clear" w:color="auto" w:fill="E1DFDD"/>
+      <w:shd w:fill="E1DFDD" w:val="clear"/>
     </w:rPr>
   </w:style>
-  <w:style w:type="character" w:customStyle="1" w:styleId="TitleChar">
+  <w:style w:type="character" w:styleId="TitleChar" w:customStyle="1">
     <w:name w:val="Title Char"/>
     <w:basedOn w:val="DefaultParagraphFont"/>
     <w:link w:val="Title"/>
     <w:uiPriority w:val="10"/>
     <w:qFormat/>
-    <w:rsid w:val="00A33BAD"/>
+    <w:rsid w:val="00a33bad"/>
     <w:rPr>
-      <w:rFonts w:ascii="Garamond" w:eastAsiaTheme="majorEastAsia" w:hAnsi="Garamond" w:cstheme="majorBidi"/>
+      <w:rFonts w:ascii="Garamond" w:hAnsi="Garamond" w:eastAsia="" w:cs="" w:cstheme="majorBidi" w:eastAsiaTheme="majorEastAsia"/>
       <w:b/>
       <w:color w:val="2E3D50"/>
       <w:spacing w:val="-10"/>
@@ -2148,36 +2112,36 @@
       <w:szCs w:val="56"/>
     </w:rPr>
   </w:style>
-  <w:style w:type="character" w:customStyle="1" w:styleId="Heading1Char">
+  <w:style w:type="character" w:styleId="Heading1Char" w:customStyle="1">
     <w:name w:val="Heading 1 Char"/>
     <w:basedOn w:val="DefaultParagraphFont"/>
     <w:link w:val="Heading1"/>
     <w:uiPriority w:val="9"/>
     <w:qFormat/>
-    <w:rsid w:val="00A33BAD"/>
+    <w:rsid w:val="00a33bad"/>
     <w:rPr>
-      <w:rFonts w:ascii="Garamond" w:eastAsiaTheme="majorEastAsia" w:hAnsi="Garamond" w:cstheme="majorBidi"/>
+      <w:rFonts w:ascii="Garamond" w:hAnsi="Garamond" w:eastAsia="" w:cs="" w:cstheme="majorBidi" w:eastAsiaTheme="majorEastAsia"/>
       <w:b/>
       <w:sz w:val="40"/>
       <w:szCs w:val="32"/>
     </w:rPr>
   </w:style>
-  <w:style w:type="character" w:customStyle="1" w:styleId="Heading2Char">
+  <w:style w:type="character" w:styleId="Heading2Char" w:customStyle="1">
     <w:name w:val="Heading 2 Char"/>
     <w:basedOn w:val="DefaultParagraphFont"/>
     <w:link w:val="Heading2"/>
     <w:uiPriority w:val="9"/>
     <w:qFormat/>
-    <w:rsid w:val="00DE72AF"/>
+    <w:rsid w:val="00de72af"/>
     <w:rPr>
-      <w:rFonts w:ascii="Garamond" w:eastAsiaTheme="majorEastAsia" w:hAnsi="Garamond" w:cstheme="majorBidi"/>
+      <w:rFonts w:ascii="Garamond" w:hAnsi="Garamond" w:eastAsia="" w:cs="" w:cstheme="majorBidi" w:eastAsiaTheme="majorEastAsia"/>
       <w:b/>
       <w:color w:val="2E3D50"/>
       <w:sz w:val="32"/>
       <w:szCs w:val="26"/>
     </w:rPr>
   </w:style>
-  <w:style w:type="character" w:customStyle="1" w:styleId="Heading3Char">
+  <w:style w:type="character" w:styleId="Heading3Char" w:customStyle="1">
     <w:name w:val="Heading 3 Char"/>
     <w:basedOn w:val="DefaultParagraphFont"/>
     <w:link w:val="Heading3"/>
@@ -2185,7 +2149,7 @@
     <w:qFormat/>
     <w:rsid w:val="00892277"/>
     <w:rPr>
-      <w:rFonts w:ascii="Garamond" w:eastAsiaTheme="majorEastAsia" w:hAnsi="Garamond" w:cstheme="majorBidi"/>
+      <w:rFonts w:ascii="Garamond" w:hAnsi="Garamond" w:eastAsia="" w:cs="" w:cstheme="majorBidi" w:eastAsiaTheme="majorEastAsia"/>
       <w:b/>
       <w:color w:val="2E3D50"/>
       <w:sz w:val="24"/>
@@ -2194,30 +2158,75 @@
   </w:style>
   <w:style w:type="character" w:styleId="Strong">
     <w:name w:val="Strong"/>
+    <w:uiPriority w:val="22"/>
     <w:qFormat/>
     <w:rPr>
       <w:b/>
       <w:bCs/>
     </w:rPr>
   </w:style>
-  <w:style w:type="character" w:customStyle="1" w:styleId="Bullets">
+  <w:style w:type="character" w:styleId="Bullets" w:customStyle="1">
     <w:name w:val="Bullets"/>
     <w:qFormat/>
     <w:rPr>
-      <w:rFonts w:ascii="OpenSymbol" w:eastAsia="OpenSymbol" w:hAnsi="OpenSymbol" w:cs="OpenSymbol"/>
+      <w:rFonts w:ascii="OpenSymbol" w:hAnsi="OpenSymbol" w:eastAsia="OpenSymbol" w:cs="OpenSymbol"/>
     </w:rPr>
   </w:style>
-  <w:style w:type="paragraph" w:customStyle="1" w:styleId="Heading">
+  <w:style w:type="character" w:styleId="annotationreference">
+    <w:name w:val="annotation reference"/>
+    <w:basedOn w:val="DefaultParagraphFont"/>
+    <w:uiPriority w:val="99"/>
+    <w:semiHidden/>
+    <w:unhideWhenUsed/>
+    <w:qFormat/>
+    <w:rsid w:val="009c5dd7"/>
+    <w:rPr>
+      <w:sz w:val="16"/>
+      <w:szCs w:val="16"/>
+    </w:rPr>
+  </w:style>
+  <w:style w:type="character" w:styleId="CommentTextChar" w:customStyle="1">
+    <w:name w:val="Comment Text Char"/>
+    <w:basedOn w:val="DefaultParagraphFont"/>
+    <w:link w:val="AnnotationText"/>
+    <w:uiPriority w:val="99"/>
+    <w:qFormat/>
+    <w:rsid w:val="009c5dd7"/>
+    <w:rPr>
+      <w:rFonts w:ascii="Garamond" w:hAnsi="Garamond" w:eastAsia="Calibri"/>
+      <w:color w:val="2E3D50"/>
+      <w:sz w:val="20"/>
+      <w:szCs w:val="20"/>
+    </w:rPr>
+  </w:style>
+  <w:style w:type="character" w:styleId="CommentSubjectChar" w:customStyle="1">
+    <w:name w:val="Comment Subject Char"/>
+    <w:basedOn w:val="CommentTextChar"/>
+    <w:link w:val="annotationsubject"/>
+    <w:uiPriority w:val="99"/>
+    <w:semiHidden/>
+    <w:qFormat/>
+    <w:rsid w:val="009c5dd7"/>
+    <w:rPr>
+      <w:rFonts w:ascii="Garamond" w:hAnsi="Garamond" w:eastAsia="Calibri"/>
+      <w:b/>
+      <w:bCs/>
+      <w:color w:val="2E3D50"/>
+      <w:sz w:val="20"/>
+      <w:szCs w:val="20"/>
+    </w:rPr>
+  </w:style>
+  <w:style w:type="paragraph" w:styleId="Heading" w:customStyle="1">
     <w:name w:val="Heading"/>
     <w:basedOn w:val="Normal"/>
     <w:next w:val="BodyText"/>
     <w:qFormat/>
     <w:pPr>
-      <w:keepNext/>
+      <w:keepNext w:val="true"/>
       <w:spacing w:before="240" w:after="120"/>
     </w:pPr>
     <w:rPr>
-      <w:rFonts w:ascii="Liberation Sans" w:eastAsia="Microsoft YaHei" w:hAnsi="Liberation Sans" w:cs="Arial"/>
+      <w:rFonts w:ascii="Liberation Sans" w:hAnsi="Liberation Sans" w:eastAsia="Microsoft YaHei" w:cs="Arial"/>
       <w:sz w:val="28"/>
       <w:szCs w:val="28"/>
     </w:rPr>
@@ -2226,18 +2235,20 @@
     <w:name w:val="Body Text"/>
     <w:basedOn w:val="Normal"/>
     <w:pPr>
-      <w:spacing w:after="140" w:line="276" w:lineRule="auto"/>
+      <w:spacing w:lineRule="auto" w:line="276" w:before="0" w:after="140"/>
     </w:pPr>
+    <w:rPr/>
   </w:style>
   <w:style w:type="paragraph" w:styleId="List">
     <w:name w:val="List"/>
     <w:basedOn w:val="BodyText"/>
+    <w:pPr/>
     <w:rPr>
       <w:rFonts w:cs="Arial"/>
     </w:rPr>
   </w:style>
   <w:style w:type="paragraph" w:styleId="Caption">
-    <w:name w:val="caption"/>
+    <w:name w:val="Caption"/>
     <w:basedOn w:val="Normal"/>
     <w:qFormat/>
     <w:pPr>
@@ -2252,7 +2263,7 @@
       <w:szCs w:val="24"/>
     </w:rPr>
   </w:style>
-  <w:style w:type="paragraph" w:customStyle="1" w:styleId="Index">
+  <w:style w:type="paragraph" w:styleId="Index" w:customStyle="1">
     <w:name w:val="Index"/>
     <w:basedOn w:val="Normal"/>
     <w:qFormat/>
@@ -2270,14 +2281,14 @@
     <w:link w:val="TitleChar"/>
     <w:uiPriority w:val="10"/>
     <w:qFormat/>
-    <w:rsid w:val="00A33BAD"/>
+    <w:rsid w:val="00a33bad"/>
     <w:pPr>
-      <w:spacing w:after="0" w:line="240" w:lineRule="auto"/>
+      <w:spacing w:lineRule="auto" w:line="240" w:before="0" w:after="0"/>
       <w:contextualSpacing/>
       <w:jc w:val="center"/>
     </w:pPr>
     <w:rPr>
-      <w:rFonts w:eastAsiaTheme="majorEastAsia" w:cstheme="majorBidi"/>
+      <w:rFonts w:eastAsia="" w:cs="" w:cstheme="majorBidi" w:eastAsiaTheme="majorEastAsia"/>
       <w:b/>
       <w:spacing w:val="-10"/>
       <w:sz w:val="56"/>
@@ -2289,76 +2300,140 @@
     <w:basedOn w:val="Normal"/>
     <w:uiPriority w:val="34"/>
     <w:qFormat/>
-    <w:rsid w:val="00DE72AF"/>
+    <w:rsid w:val="00de72af"/>
     <w:pPr>
+      <w:spacing w:before="0" w:after="160"/>
       <w:ind w:left="720"/>
       <w:contextualSpacing/>
     </w:pPr>
+    <w:rPr/>
   </w:style>
   <w:style w:type="paragraph" w:styleId="Revision">
     <w:name w:val="Revision"/>
     <w:uiPriority w:val="99"/>
     <w:semiHidden/>
     <w:qFormat/>
-    <w:rsid w:val="00AA5764"/>
+    <w:rsid w:val="00aa5764"/>
+    <w:pPr>
+      <w:widowControl/>
+      <w:suppressAutoHyphens w:val="true"/>
+      <w:bidi w:val="0"/>
+      <w:spacing w:before="0" w:after="0"/>
+      <w:jc w:val="left"/>
+    </w:pPr>
     <w:rPr>
-      <w:rFonts w:ascii="Garamond" w:eastAsia="Calibri" w:hAnsi="Garamond"/>
+      <w:rFonts w:ascii="Garamond" w:hAnsi="Garamond" w:eastAsia="Calibri" w:cs=""/>
       <w:color w:val="2E3D50"/>
+      <w:kern w:val="2"/>
       <w:sz w:val="24"/>
+      <w:szCs w:val="22"/>
+      <w:lang w:val="en-US" w:eastAsia="en-US" w:bidi="ar-SA"/>
     </w:rPr>
+  </w:style>
+  <w:style w:type="paragraph" w:styleId="AnnotationText">
+    <w:name w:val="Annotation Text"/>
+    <w:basedOn w:val="Normal"/>
+    <w:link w:val="CommentTextChar"/>
+    <w:uiPriority w:val="99"/>
+    <w:unhideWhenUsed/>
+    <w:rsid w:val="009c5dd7"/>
+    <w:pPr>
+      <w:spacing w:lineRule="auto" w:line="240"/>
+    </w:pPr>
+    <w:rPr>
+      <w:sz w:val="20"/>
+      <w:szCs w:val="20"/>
+    </w:rPr>
+  </w:style>
+  <w:style w:type="paragraph" w:styleId="annotationsubject">
+    <w:name w:val="annotation subject"/>
+    <w:basedOn w:val="AnnotationText"/>
+    <w:next w:val="AnnotationText"/>
+    <w:link w:val="CommentSubjectChar"/>
+    <w:uiPriority w:val="99"/>
+    <w:semiHidden/>
+    <w:unhideWhenUsed/>
+    <w:qFormat/>
+    <w:rsid w:val="009c5dd7"/>
+    <w:pPr/>
+    <w:rPr>
+      <w:b/>
+      <w:bCs/>
+    </w:rPr>
+  </w:style>
+  <w:style w:type="numbering" w:styleId="NoList" w:default="1">
+    <w:name w:val="No List"/>
+    <w:uiPriority w:val="99"/>
+    <w:semiHidden/>
+    <w:unhideWhenUsed/>
+    <w:qFormat/>
+  </w:style>
+  <w:style w:type="table" w:default="1" w:styleId="TableNormal">
+    <w:name w:val="Normal Table"/>
+    <w:uiPriority w:val="99"/>
+    <w:semiHidden/>
+    <w:unhideWhenUsed/>
+    <w:tblPr>
+      <w:tblCellMar>
+        <w:top w:w="0" w:type="dxa"/>
+        <w:left w:w="108" w:type="dxa"/>
+        <w:bottom w:w="0" w:type="dxa"/>
+        <w:right w:w="108" w:type="dxa"/>
+      </w:tblCellMar>
+    </w:tblPr>
   </w:style>
 </w:styles>
 </file>
 
 <file path=word/theme/theme1.xml><?xml version="1.0" encoding="utf-8"?>
-<a:theme xmlns:a="http://schemas.openxmlformats.org/drawingml/2006/main" name="Office Theme">
+<a:theme xmlns:a="http://schemas.openxmlformats.org/drawingml/2006/main" xmlns:r="http://schemas.openxmlformats.org/officeDocument/2006/relationships" name="Office Theme">
   <a:themeElements>
     <a:clrScheme name="Office">
       <a:dk1>
         <a:srgbClr val="000000"/>
       </a:dk1>
       <a:lt1>
-        <a:srgbClr val="FFFFFF"/>
+        <a:srgbClr val="ffffff"/>
       </a:lt1>
       <a:dk2>
-        <a:srgbClr val="44546A"/>
+        <a:srgbClr val="44546a"/>
       </a:dk2>
       <a:lt2>
-        <a:srgbClr val="E7E6E6"/>
+        <a:srgbClr val="e7e6e6"/>
       </a:lt2>
       <a:accent1>
-        <a:srgbClr val="4472C4"/>
+        <a:srgbClr val="4472c4"/>
       </a:accent1>
       <a:accent2>
-        <a:srgbClr val="ED7D31"/>
+        <a:srgbClr val="ed7d31"/>
       </a:accent2>
       <a:accent3>
-        <a:srgbClr val="A5A5A5"/>
+        <a:srgbClr val="a5a5a5"/>
       </a:accent3>
       <a:accent4>
-        <a:srgbClr val="FFC000"/>
+        <a:srgbClr val="ffc000"/>
       </a:accent4>
       <a:accent5>
-        <a:srgbClr val="5B9BD5"/>
+        <a:srgbClr val="5b9bd5"/>
       </a:accent5>
       <a:accent6>
-        <a:srgbClr val="70AD47"/>
+        <a:srgbClr val="70ad47"/>
       </a:accent6>
       <a:hlink>
-        <a:srgbClr val="0563C1"/>
+        <a:srgbClr val="0563c1"/>
       </a:hlink>
       <a:folHlink>
-        <a:srgbClr val="954F72"/>
+        <a:srgbClr val="954f72"/>
       </a:folHlink>
     </a:clrScheme>
     <a:fontScheme name="Office">
       <a:majorFont>
-        <a:latin typeface="Calibri Light" panose="020F0302020204030204"/>
+        <a:latin typeface="Calibri Light" panose="020F0302020204030204" pitchFamily="0" charset="1"/>
         <a:ea typeface=""/>
         <a:cs typeface=""/>
       </a:majorFont>
       <a:minorFont>
-        <a:latin typeface="Calibri" panose="020F0502020204030204"/>
+        <a:latin typeface="Calibri" panose="020F0502020204030204" pitchFamily="0" charset="1"/>
         <a:ea typeface=""/>
         <a:cs typeface=""/>
       </a:minorFont>
@@ -2390,7 +2465,7 @@
             </a:gs>
           </a:gsLst>
           <a:lin ang="5400000" scaled="0"/>
-          <a:tileRect/>
+          <a:tileRect l="0" t="0" r="0" b="0"/>
         </a:gradFill>
         <a:gradFill>
           <a:gsLst>
@@ -2414,7 +2489,7 @@
             </a:gs>
           </a:gsLst>
           <a:lin ang="5400000" scaled="0"/>
-          <a:tileRect/>
+          <a:tileRect l="0" t="0" r="0" b="0"/>
         </a:gradFill>
       </a:fillStyleLst>
       <a:lnStyleLst>
@@ -2474,12 +2549,10 @@
             </a:gs>
           </a:gsLst>
           <a:lin ang="5400000" scaled="0"/>
-          <a:tileRect/>
+          <a:tileRect l="0" t="0" r="0" b="0"/>
         </a:gradFill>
       </a:bgFillStyleLst>
     </a:fmtScheme>
   </a:themeElements>
-  <a:objectDefaults/>
-  <a:extraClrSchemeLst/>
 </a:theme>
 </file>
</xml_diff>